<commit_message>
Add a boilerplate and the why-this-category answer to the Eridu intro script
Same treatment as ASI and Second Front: an About Eridu boilerplate at the
top, and a prepared answer to why the AI networking category is open:
cloud and compute seats are crowded (Reuters, May 2026), while capped aero
computing and the cost cap make removing bottlenecks a story teams get.

Co-Authored-By: Claude Opus 5.5 <noreply@anthropic.com>
Claude-Session: https://claude.ai/code/session_011Vvxd2V3zerAfjn84yXuuv
</commit_message>
<xml_diff>
--- a/call-scripts/Eridu-F1-Intro-Call-Script.docx
+++ b/call-scripts/Eridu-F1-Intro-Call-Script.docx
@@ -68,6 +68,52 @@
           <w:sz w:val="30"/>
           <w:szCs w:val="30"/>
         </w:rPr>
+        <w:t xml:space="preserve">Boilerplate: what Eridu does</w:t>
+      </w:r>
+    </w:p>
+    <w:p>
+      <w:pPr>
+        <w:spacing w:after="80" w:before="80"/>
+      </w:pPr>
+      <w:r>
+        <w:rPr>
+          <w:b/>
+          <w:bCs/>
+        </w:rPr>
+        <w:t xml:space="preserve">About Eridu:</w:t>
+      </w:r>
+      <w:r>
+        <w:t xml:space="preserve"> Eridu is a Saratoga, California start-up building a new kind of network switch for AI data centers: the hardware that links GPUs so thousands of them can work as one machine. It says today's networks have become the bottleneck, which it calls the "network wall", leaving expensive GPUs sitting idle, and it's designing its switch from a clean sheet across silicon, packaging, systems and optics, built on TSMC technology. It's led by CEO Drew Perkins, who co-founded Infinera and Lightera, and co-founder Omar Hassen, who designed networking chips at Broadcom and Marvell. Eridu came out of stealth in March 2026 with a $200M Series A ($230M raised in total), backed by John Doerr, Socratic Partners, Hudson River Trading, MediaTek and TSMC's investment arm, among others. It's building first for the hyperscalers, then neoclouds, sovereign clouds and large enterprise AI data centers; no product is shipping yet.</w:t>
+      </w:r>
+    </w:p>
+    <w:p>
+      <w:pPr>
+        <w:spacing w:after="80" w:before="80"/>
+      </w:pPr>
+      <w:r>
+        <w:rPr>
+          <w:b/>
+          <w:bCs/>
+        </w:rPr>
+        <w:t xml:space="preserve">In one line, if someone asks on the call:</w:t>
+      </w:r>
+      <w:r>
+        <w:t xml:space="preserve"> "They're building a new kind of network switch so thousands of AI chips can work as one machine, with less delay and less power."</w:t>
+      </w:r>
+    </w:p>
+    <w:p>
+      <w:pPr>
+        <w:pStyle w:val="Heading1"/>
+        <w:spacing w:after="120" w:before="240"/>
+      </w:pPr>
+      <w:r>
+        <w:rPr>
+          <w:b/>
+          <w:bCs/>
+          <w:color w:val="2E74B5"/>
+          <w:sz w:val="30"/>
+          <w:szCs w:val="30"/>
+        </w:rPr>
         <w:t xml:space="preserve">1. Brand snapshot (not spoken)</w:t>
       </w:r>
     </w:p>
@@ -437,7 +483,7 @@
           <w:iCs/>
           <w:color w:val="7F7F7F"/>
         </w:rPr>
-        <w:t xml:space="preserve">[Then listen and take notes. Pick from section 3 as it goes; don't run the list in order. If they ask "so where do you see us fitting?": "Too early to say, and I'd be guessing. If you pushed me, I'd start small, around the people you need to get in front of, and only look at anything bigger once the product's out. But tell me more first."]</w:t>
+        <w:t xml:space="preserve">[Then listen and take notes. Pick from section 4 as it goes; don't run the list in order. If they ask "so where do you see us fitting?": "Too early to say, and I'd be guessing. If you pushed me, I'd start small, around the people you need to get in front of, and only look at anything bigger once the product's out. But tell me more first."]</w:t>
       </w:r>
     </w:p>
     <w:p>
@@ -453,7 +499,7 @@
           <w:sz w:val="30"/>
           <w:szCs w:val="30"/>
         </w:rPr>
-        <w:t xml:space="preserve">3. Questions to ask them</w:t>
+        <w:t xml:space="preserve">3. If they ask: "Why is this category open? Why would teams want this?"</w:t>
       </w:r>
     </w:p>
     <w:p>
@@ -466,34 +512,94 @@
           <w:iCs/>
           <w:color w:val="7F7F7F"/>
         </w:rPr>
-        <w:t xml:space="preserve">[Pick six to eight as the conversation goes. Follow-ups are optional.]</w:t>
-      </w:r>
-    </w:p>
-    <w:p>
-      <w:pPr>
-        <w:spacing w:after="80" w:before="80"/>
-      </w:pPr>
-      <w:r>
-        <w:rPr>
-          <w:b/>
-          <w:bCs/>
-        </w:rPr>
-        <w:t xml:space="preserve">Where they are</w:t>
-      </w:r>
-    </w:p>
-    <w:p>
-      <w:pPr>
-        <w:pBdr>
-          <w:left w:val="single" w:color="2E74B5" w:sz="18" w:space="12"/>
-        </w:pBdr>
-        <w:spacing w:after="60" w:before="60"/>
-        <w:ind w:left="420"/>
-      </w:pPr>
-      <w:r>
-        <w:rPr>
-          <w:color w:val="1F3864"/>
-        </w:rPr>
-        <w:t xml:space="preserve">"What does the next year look like for you? Is it heads down getting the product out, or are you already selling?"</w:t>
+        <w:t xml:space="preserve">[The question to expect, because the email said teams are looking. Say it with confidence, and keep the last lines in.]</w:t>
+      </w:r>
+    </w:p>
+    <w:p>
+      <w:pPr>
+        <w:pBdr>
+          <w:left w:val="single" w:color="2E74B5" w:sz="18" w:space="12"/>
+        </w:pBdr>
+        <w:spacing w:after="60" w:before="60"/>
+        <w:ind w:left="420"/>
+      </w:pPr>
+      <w:r>
+        <w:rPr>
+          <w:color w:val="1F3864"/>
+        </w:rPr>
+        <w:t xml:space="preserve">"Good question, and I'll give you the real answer, not the sales one. Tech's become quite saturated in F1. It's now the biggest sponsorship category for the teams, and Reuters counted eight new AI deals in six months earlier this year. The cloud and compute seats especially: Oracle's on the Red Bull, Google Cloud's with McLaren, Microsoft's been reported with Mercedes, and CoreWeave does the AI cloud at Aston Martin.</w:t>
+      </w:r>
+    </w:p>
+    <w:p>
+      <w:pPr>
+        <w:pBdr>
+          <w:left w:val="single" w:color="2E74B5" w:sz="18" w:space="12"/>
+        </w:pBdr>
+        <w:spacing w:after="60" w:before="60"/>
+        <w:ind w:left="420"/>
+      </w:pPr>
+      <w:r>
+        <w:rPr>
+          <w:color w:val="1F3864"/>
+        </w:rPr>
+        <w:t xml:space="preserve">So what stands out now isn't another cloud or another 'AI partner'. What you don't hear much about is the bit that ties all that compute together, the network. And that's a story an F1 team gets better than most.</w:t>
+      </w:r>
+    </w:p>
+    <w:p>
+      <w:pPr>
+        <w:pBdr>
+          <w:left w:val="single" w:color="2E74B5" w:sz="18" w:space="12"/>
+        </w:pBdr>
+        <w:spacing w:after="60" w:before="60"/>
+        <w:ind w:left="420"/>
+      </w:pPr>
+      <w:r>
+        <w:rPr>
+          <w:color w:val="1F3864"/>
+        </w:rPr>
+        <w:t xml:space="preserve">Because the rules cap how much aero computing a team can do, and there's been a cost cap since 2021. So they can't win by buying more hardware. They win by getting more out of what they're allowed, by taking the bottlenecks out. That's pretty much your network wall, in racing terms.</w:t>
+      </w:r>
+    </w:p>
+    <w:p>
+      <w:pPr>
+        <w:pBdr>
+          <w:left w:val="single" w:color="2E74B5" w:sz="18" w:space="12"/>
+        </w:pBdr>
+        <w:spacing w:after="60" w:before="60"/>
+        <w:ind w:left="420"/>
+      </w:pPr>
+      <w:r>
+        <w:rPr>
+          <w:color w:val="1F3864"/>
+        </w:rPr>
+        <w:t xml:space="preserve">Whether that seat's free at a given team is what we check properly. I won't tell you it's open everywhere. And for you the timing matters too, so I'd want anything to line up with your launch, not run ahead of it."</w:t>
+      </w:r>
+    </w:p>
+    <w:p>
+      <w:pPr>
+        <w:spacing w:after="80" w:before="80"/>
+      </w:pPr>
+      <w:r>
+        <w:rPr>
+          <w:b/>
+          <w:bCs/>
+        </w:rPr>
+        <w:t xml:space="preserve">Short version, if there's no time:</w:t>
+      </w:r>
+    </w:p>
+    <w:p>
+      <w:pPr>
+        <w:pBdr>
+          <w:left w:val="single" w:color="2E74B5" w:sz="18" w:space="12"/>
+        </w:pBdr>
+        <w:spacing w:after="60" w:before="60"/>
+        <w:ind w:left="420"/>
+      </w:pPr>
+      <w:r>
+        <w:rPr>
+          <w:color w:val="1F3864"/>
+        </w:rPr>
+        <w:t xml:space="preserve">"Tech's quite saturated in F1 now, and the cloud and compute seats mostly have big names in them, but the network that ties it all together is a story you don't hear much. And with capped aero computing and a cost cap, teams win by getting more out of a fixed allowance, which is your story in racing terms. Whether the seat's free at a given team is what we'd check properly."</w:t>
       </w:r>
     </w:p>
     <w:p>
@@ -506,34 +612,7 @@
           <w:iCs/>
           <w:color w:val="7F7F7F"/>
         </w:rPr>
-        <w:t xml:space="preserve">[Follow-up: "What's the moment you're building towards? A launch, a first customer you can name?" If they say "first we ship": that's the timing signal. Anything in F1 should line up with that moment, not run ahead of it.]</w:t>
-      </w:r>
-    </w:p>
-    <w:p>
-      <w:pPr>
-        <w:spacing w:after="80" w:before="80"/>
-      </w:pPr>
-      <w:r>
-        <w:rPr>
-          <w:b/>
-          <w:bCs/>
-        </w:rPr>
-        <w:t xml:space="preserve">Who they need to reach</w:t>
-      </w:r>
-    </w:p>
-    <w:p>
-      <w:pPr>
-        <w:pBdr>
-          <w:left w:val="single" w:color="2E74B5" w:sz="18" w:space="12"/>
-        </w:pBdr>
-        <w:spacing w:after="60" w:before="60"/>
-        <w:ind w:left="420"/>
-      </w:pPr>
-      <w:r>
-        <w:rPr>
-          <w:color w:val="1F3864"/>
-        </w:rPr>
-        <w:t xml:space="preserve">"Who are the people you most need in a room? I'm guessing it's a fairly short list of senior infrastructure people at a handful of very big companies."</w:t>
+        <w:t xml:space="preserve">[On the email: it said "a few of our Formula 1 teams are looking for an Official AI Networking Partner". If they quote it back, stay consistent without going further: "What I meant is there are teams we work with where an AI networking partner could make sense. Which ones, and whether the seat's free, is exactly what the grid mapping tells us." Never name a team as looking, and never say the category is open.]</w:t>
       </w:r>
     </w:p>
     <w:p>
@@ -546,34 +625,7 @@
           <w:iCs/>
           <w:color w:val="7F7F7F"/>
         </w:rPr>
-        <w:t xml:space="preserve">[Follow-up: "Is it the network architects who decide, or does it go up to the CTO and the CFO?" If they say it's a few dozen people: good. That's a hospitality and relationships story, not a TV story.]</w:t>
-      </w:r>
-    </w:p>
-    <w:p>
-      <w:pPr>
-        <w:spacing w:after="80" w:before="80"/>
-      </w:pPr>
-      <w:r>
-        <w:rPr>
-          <w:b/>
-          <w:bCs/>
-        </w:rPr>
-        <w:t xml:space="preserve">Markets</w:t>
-      </w:r>
-    </w:p>
-    <w:p>
-      <w:pPr>
-        <w:pBdr>
-          <w:left w:val="single" w:color="2E74B5" w:sz="18" w:space="12"/>
-        </w:pBdr>
-        <w:spacing w:after="60" w:before="60"/>
-        <w:ind w:left="420"/>
-      </w:pPr>
-      <w:r>
-        <w:rPr>
-          <w:color w:val="1F3864"/>
-        </w:rPr>
-        <w:t xml:space="preserve">"Is it mostly a Silicon Valley conversation for you, or are you seeing demand elsewhere? I'm thinking sovereign AI projects, the Gulf, Asia."</w:t>
+        <w:t xml:space="preserve">[If they push, "so which teams?": "That's the grid mapping, and it's the first thing we do after this call. I'd rather come back to you with names I can stand behind than guess today."]</w:t>
       </w:r>
     </w:p>
     <w:p>
@@ -586,34 +638,23 @@
           <w:iCs/>
           <w:color w:val="7F7F7F"/>
         </w:rPr>
-        <w:t xml:space="preserve">[Follow-up: "Where do you need to be seen in the next couple of years?" If they name the Gulf or Asia: Saudi Arabia, Qatar, Abu Dhabi and Singapore are all on the calendar. The US races are Miami, Austin and Las Vegas.]</w:t>
-      </w:r>
-    </w:p>
-    <w:p>
-      <w:pPr>
-        <w:spacing w:after="80" w:before="80"/>
-      </w:pPr>
-      <w:r>
-        <w:rPr>
-          <w:b/>
-          <w:bCs/>
-        </w:rPr>
-        <w:t xml:space="preserve">Marketing and partnerships today</w:t>
-      </w:r>
-    </w:p>
-    <w:p>
-      <w:pPr>
-        <w:pBdr>
-          <w:left w:val="single" w:color="2E74B5" w:sz="18" w:space="12"/>
-        </w:pBdr>
-        <w:spacing w:after="60" w:before="60"/>
-        <w:ind w:left="420"/>
-      </w:pPr>
-      <w:r>
-        <w:rPr>
-          <w:color w:val="1F3864"/>
-        </w:rPr>
-        <w:t xml:space="preserve">"How do you think about marketing at this stage? Is it mostly events like OCP and the analysts, or are you starting to think about the brand more widely?"</w:t>
+        <w:t xml:space="preserve">[Backing, if they want proof the tech seats are busy: Reuters reported on 4 May 2026 that technology is now the top spending category for F1 teams (SponsorUnited's estimate; background only, don't quote dollar figures), that Ampere Analysis counted eight new AI partnerships in the previous six months, and that AI and machine learning brands are four of the top 15 new sponsorship investors, including CoreWeave with Aston Martin. Arm is also Aston Martin's AI compute platform provider. "You don't hear much about the network" is an observation, not a claim that no team has a networking partner: RUCKUS does wireless at Haas, and the team-by-team check happens at the recommendations stage.]</w:t>
+      </w:r>
+    </w:p>
+    <w:p>
+      <w:pPr>
+        <w:pStyle w:val="Heading1"/>
+        <w:spacing w:after="120" w:before="240"/>
+      </w:pPr>
+      <w:r>
+        <w:rPr>
+          <w:b/>
+          <w:bCs/>
+          <w:color w:val="2E74B5"/>
+          <w:sz w:val="30"/>
+          <w:szCs w:val="30"/>
+        </w:rPr>
+        <w:t xml:space="preserve">4. Questions to ask them</w:t>
       </w:r>
     </w:p>
     <w:p>
@@ -626,34 +667,34 @@
           <w:iCs/>
           <w:color w:val="7F7F7F"/>
         </w:rPr>
-        <w:t xml:space="preserve">[Follow-up: "Have you or the team done anything in sport at previous companies, even small?" If yes, ask what worked and what didn't. That tells you more than any deck.]</w:t>
-      </w:r>
-    </w:p>
-    <w:p>
-      <w:pPr>
-        <w:spacing w:after="80" w:before="80"/>
-      </w:pPr>
-      <w:r>
-        <w:rPr>
-          <w:b/>
-          <w:bCs/>
-        </w:rPr>
-        <w:t xml:space="preserve">Who else they're talking to</w:t>
-      </w:r>
-    </w:p>
-    <w:p>
-      <w:pPr>
-        <w:pBdr>
-          <w:left w:val="single" w:color="2E74B5" w:sz="18" w:space="12"/>
-        </w:pBdr>
-        <w:spacing w:after="60" w:before="60"/>
-        <w:ind w:left="420"/>
-      </w:pPr>
-      <w:r>
-        <w:rPr>
-          <w:color w:val="1F3864"/>
-        </w:rPr>
-        <w:t xml:space="preserve">"Is it purely B2B for you, or is there a wider audience you care about? Investors, the engineers you're trying to hire?"</w:t>
+        <w:t xml:space="preserve">[Pick six to eight as the conversation goes. Follow-ups are optional.]</w:t>
+      </w:r>
+    </w:p>
+    <w:p>
+      <w:pPr>
+        <w:spacing w:after="80" w:before="80"/>
+      </w:pPr>
+      <w:r>
+        <w:rPr>
+          <w:b/>
+          <w:bCs/>
+        </w:rPr>
+        <w:t xml:space="preserve">Where they are</w:t>
+      </w:r>
+    </w:p>
+    <w:p>
+      <w:pPr>
+        <w:pBdr>
+          <w:left w:val="single" w:color="2E74B5" w:sz="18" w:space="12"/>
+        </w:pBdr>
+        <w:spacing w:after="60" w:before="60"/>
+        <w:ind w:left="420"/>
+      </w:pPr>
+      <w:r>
+        <w:rPr>
+          <w:color w:val="1F3864"/>
+        </w:rPr>
+        <w:t xml:space="preserve">"What does the next year look like for you? Is it heads down getting the product out, or are you already selling?"</w:t>
       </w:r>
     </w:p>
     <w:p>
@@ -666,34 +707,34 @@
           <w:iCs/>
           <w:color w:val="7F7F7F"/>
         </w:rPr>
-        <w:t xml:space="preserve">[If they say hiring: F1 is an engineering brand that engineers recognise, which can help with recruiting. Keep it as a side benefit, not the reason.]</w:t>
-      </w:r>
-    </w:p>
-    <w:p>
-      <w:pPr>
-        <w:spacing w:after="80" w:before="80"/>
-      </w:pPr>
-      <w:r>
-        <w:rPr>
-          <w:b/>
-          <w:bCs/>
-        </w:rPr>
-        <w:t xml:space="preserve">How they measure success</w:t>
-      </w:r>
-    </w:p>
-    <w:p>
-      <w:pPr>
-        <w:pBdr>
-          <w:left w:val="single" w:color="2E74B5" w:sz="18" w:space="12"/>
-        </w:pBdr>
-        <w:spacing w:after="60" w:before="60"/>
-        <w:ind w:left="420"/>
-      </w:pPr>
-      <w:r>
-        <w:rPr>
-          <w:color w:val="1F3864"/>
-        </w:rPr>
-        <w:t xml:space="preserve">"When you spend on marketing now, how do you judge it? Meetings, pipeline, design-ins?"</w:t>
+        <w:t xml:space="preserve">[Follow-up: "What's the moment you're building towards? A launch, a first customer you can name?" If they say "first we ship": that's the timing signal. Anything in F1 should line up with that moment, not run ahead of it.]</w:t>
+      </w:r>
+    </w:p>
+    <w:p>
+      <w:pPr>
+        <w:spacing w:after="80" w:before="80"/>
+      </w:pPr>
+      <w:r>
+        <w:rPr>
+          <w:b/>
+          <w:bCs/>
+        </w:rPr>
+        <w:t xml:space="preserve">Who they need to reach</w:t>
+      </w:r>
+    </w:p>
+    <w:p>
+      <w:pPr>
+        <w:pBdr>
+          <w:left w:val="single" w:color="2E74B5" w:sz="18" w:space="12"/>
+        </w:pBdr>
+        <w:spacing w:after="60" w:before="60"/>
+        <w:ind w:left="420"/>
+      </w:pPr>
+      <w:r>
+        <w:rPr>
+          <w:color w:val="1F3864"/>
+        </w:rPr>
+        <w:t xml:space="preserve">"Who are the people you most need in a room? I'm guessing it's a fairly short list of senior infrastructure people at a handful of very big companies."</w:t>
       </w:r>
     </w:p>
     <w:p>
@@ -706,34 +747,34 @@
           <w:iCs/>
           <w:color w:val="7F7F7F"/>
         </w:rPr>
-        <w:t xml:space="preserve">[Follow-up: "What would a good year look like, in the numbers you'd show your board?" Whatever they say here becomes the ROI measure we agree upfront.]</w:t>
-      </w:r>
-    </w:p>
-    <w:p>
-      <w:pPr>
-        <w:spacing w:after="80" w:before="80"/>
-      </w:pPr>
-      <w:r>
-        <w:rPr>
-          <w:b/>
-          <w:bCs/>
-        </w:rPr>
-        <w:t xml:space="preserve">F1 familiarity</w:t>
-      </w:r>
-    </w:p>
-    <w:p>
-      <w:pPr>
-        <w:pBdr>
-          <w:left w:val="single" w:color="2E74B5" w:sz="18" w:space="12"/>
-        </w:pBdr>
-        <w:spacing w:after="60" w:before="60"/>
-        <w:ind w:left="420"/>
-      </w:pPr>
-      <w:r>
-        <w:rPr>
-          <w:color w:val="1F3864"/>
-        </w:rPr>
-        <w:t xml:space="preserve">"And how much do you follow Formula 1 yourself? Some people are really into it, some just catch the odd race."</w:t>
+        <w:t xml:space="preserve">[Follow-up: "Is it the network architects who decide, or does it go up to the CTO and the CFO?" If they say it's a few dozen people: good. That's a hospitality and relationships story, not a TV story.]</w:t>
+      </w:r>
+    </w:p>
+    <w:p>
+      <w:pPr>
+        <w:spacing w:after="80" w:before="80"/>
+      </w:pPr>
+      <w:r>
+        <w:rPr>
+          <w:b/>
+          <w:bCs/>
+        </w:rPr>
+        <w:t xml:space="preserve">Markets</w:t>
+      </w:r>
+    </w:p>
+    <w:p>
+      <w:pPr>
+        <w:pBdr>
+          <w:left w:val="single" w:color="2E74B5" w:sz="18" w:space="12"/>
+        </w:pBdr>
+        <w:spacing w:after="60" w:before="60"/>
+        <w:ind w:left="420"/>
+      </w:pPr>
+      <w:r>
+        <w:rPr>
+          <w:color w:val="1F3864"/>
+        </w:rPr>
+        <w:t xml:space="preserve">"Is it mostly a Silicon Valley conversation for you, or are you seeing demand elsewhere? I'm thinking sovereign AI projects, the Gulf, Asia."</w:t>
       </w:r>
     </w:p>
     <w:p>
@@ -746,34 +787,34 @@
           <w:iCs/>
           <w:color w:val="7F7F7F"/>
         </w:rPr>
-        <w:t xml:space="preserve">[If they're fans, let them talk. If not, the thirty-second version: Liberty Media bought the sport in 2017, there are eleven teams including two American ones, Haas and Cadillac, and you can come in through a team, a driver, or hospitality on its own.]</w:t>
-      </w:r>
-    </w:p>
-    <w:p>
-      <w:pPr>
-        <w:spacing w:after="80" w:before="80"/>
-      </w:pPr>
-      <w:r>
-        <w:rPr>
-          <w:b/>
-          <w:bCs/>
-        </w:rPr>
-        <w:t xml:space="preserve">Decision, budget and timing</w:t>
-      </w:r>
-    </w:p>
-    <w:p>
-      <w:pPr>
-        <w:pBdr>
-          <w:left w:val="single" w:color="2E74B5" w:sz="18" w:space="12"/>
-        </w:pBdr>
-        <w:spacing w:after="60" w:before="60"/>
-        <w:ind w:left="420"/>
-      </w:pPr>
-      <w:r>
-        <w:rPr>
-          <w:color w:val="1F3864"/>
-        </w:rPr>
-        <w:t xml:space="preserve">"If something did make sense, how would a decision get made? Is it you and Drew, or does it go to the board? And is there a budget for this kind of thing yet, or would it need building?"</w:t>
+        <w:t xml:space="preserve">[Follow-up: "Where do you need to be seen in the next couple of years?" If they name the Gulf or Asia: Saudi Arabia, Qatar, Abu Dhabi and Singapore are all on the calendar. The US races are Miami, Austin and Las Vegas.]</w:t>
+      </w:r>
+    </w:p>
+    <w:p>
+      <w:pPr>
+        <w:spacing w:after="80" w:before="80"/>
+      </w:pPr>
+      <w:r>
+        <w:rPr>
+          <w:b/>
+          <w:bCs/>
+        </w:rPr>
+        <w:t xml:space="preserve">Marketing and partnerships today</w:t>
+      </w:r>
+    </w:p>
+    <w:p>
+      <w:pPr>
+        <w:pBdr>
+          <w:left w:val="single" w:color="2E74B5" w:sz="18" w:space="12"/>
+        </w:pBdr>
+        <w:spacing w:after="60" w:before="60"/>
+        <w:ind w:left="420"/>
+      </w:pPr>
+      <w:r>
+        <w:rPr>
+          <w:color w:val="1F3864"/>
+        </w:rPr>
+        <w:t xml:space="preserve">"How do you think about marketing at this stage? Is it mostly events like OCP and the analysts, or are you starting to think about the brand more widely?"</w:t>
       </w:r>
     </w:p>
     <w:p>
@@ -786,6 +827,166 @@
           <w:iCs/>
           <w:color w:val="7F7F7F"/>
         </w:rPr>
+        <w:t xml:space="preserve">[Follow-up: "Have you or the team done anything in sport at previous companies, even small?" If yes, ask what worked and what didn't. That tells you more than any deck.]</w:t>
+      </w:r>
+    </w:p>
+    <w:p>
+      <w:pPr>
+        <w:spacing w:after="80" w:before="80"/>
+      </w:pPr>
+      <w:r>
+        <w:rPr>
+          <w:b/>
+          <w:bCs/>
+        </w:rPr>
+        <w:t xml:space="preserve">Who else they're talking to</w:t>
+      </w:r>
+    </w:p>
+    <w:p>
+      <w:pPr>
+        <w:pBdr>
+          <w:left w:val="single" w:color="2E74B5" w:sz="18" w:space="12"/>
+        </w:pBdr>
+        <w:spacing w:after="60" w:before="60"/>
+        <w:ind w:left="420"/>
+      </w:pPr>
+      <w:r>
+        <w:rPr>
+          <w:color w:val="1F3864"/>
+        </w:rPr>
+        <w:t xml:space="preserve">"Is it purely B2B for you, or is there a wider audience you care about? Investors, the engineers you're trying to hire?"</w:t>
+      </w:r>
+    </w:p>
+    <w:p>
+      <w:pPr>
+        <w:spacing w:after="80" w:before="80"/>
+      </w:pPr>
+      <w:r>
+        <w:rPr>
+          <w:i/>
+          <w:iCs/>
+          <w:color w:val="7F7F7F"/>
+        </w:rPr>
+        <w:t xml:space="preserve">[If they say hiring: F1 is an engineering brand that engineers recognise, which can help with recruiting. Keep it as a side benefit, not the reason.]</w:t>
+      </w:r>
+    </w:p>
+    <w:p>
+      <w:pPr>
+        <w:spacing w:after="80" w:before="80"/>
+      </w:pPr>
+      <w:r>
+        <w:rPr>
+          <w:b/>
+          <w:bCs/>
+        </w:rPr>
+        <w:t xml:space="preserve">How they measure success</w:t>
+      </w:r>
+    </w:p>
+    <w:p>
+      <w:pPr>
+        <w:pBdr>
+          <w:left w:val="single" w:color="2E74B5" w:sz="18" w:space="12"/>
+        </w:pBdr>
+        <w:spacing w:after="60" w:before="60"/>
+        <w:ind w:left="420"/>
+      </w:pPr>
+      <w:r>
+        <w:rPr>
+          <w:color w:val="1F3864"/>
+        </w:rPr>
+        <w:t xml:space="preserve">"When you spend on marketing now, how do you judge it? Meetings, pipeline, design-ins?"</w:t>
+      </w:r>
+    </w:p>
+    <w:p>
+      <w:pPr>
+        <w:spacing w:after="80" w:before="80"/>
+      </w:pPr>
+      <w:r>
+        <w:rPr>
+          <w:i/>
+          <w:iCs/>
+          <w:color w:val="7F7F7F"/>
+        </w:rPr>
+        <w:t xml:space="preserve">[Follow-up: "What would a good year look like, in the numbers you'd show your board?" Whatever they say here becomes the ROI measure we agree upfront.]</w:t>
+      </w:r>
+    </w:p>
+    <w:p>
+      <w:pPr>
+        <w:spacing w:after="80" w:before="80"/>
+      </w:pPr>
+      <w:r>
+        <w:rPr>
+          <w:b/>
+          <w:bCs/>
+        </w:rPr>
+        <w:t xml:space="preserve">F1 familiarity</w:t>
+      </w:r>
+    </w:p>
+    <w:p>
+      <w:pPr>
+        <w:pBdr>
+          <w:left w:val="single" w:color="2E74B5" w:sz="18" w:space="12"/>
+        </w:pBdr>
+        <w:spacing w:after="60" w:before="60"/>
+        <w:ind w:left="420"/>
+      </w:pPr>
+      <w:r>
+        <w:rPr>
+          <w:color w:val="1F3864"/>
+        </w:rPr>
+        <w:t xml:space="preserve">"And how much do you follow Formula 1 yourself? Some people are really into it, some just catch the odd race."</w:t>
+      </w:r>
+    </w:p>
+    <w:p>
+      <w:pPr>
+        <w:spacing w:after="80" w:before="80"/>
+      </w:pPr>
+      <w:r>
+        <w:rPr>
+          <w:i/>
+          <w:iCs/>
+          <w:color w:val="7F7F7F"/>
+        </w:rPr>
+        <w:t xml:space="preserve">[If they're fans, let them talk. If not, the thirty-second version: Liberty Media bought the sport in 2017, there are eleven teams including two American ones, Haas and Cadillac, and you can come in through a team, a driver, or hospitality on its own.]</w:t>
+      </w:r>
+    </w:p>
+    <w:p>
+      <w:pPr>
+        <w:spacing w:after="80" w:before="80"/>
+      </w:pPr>
+      <w:r>
+        <w:rPr>
+          <w:b/>
+          <w:bCs/>
+        </w:rPr>
+        <w:t xml:space="preserve">Decision, budget and timing</w:t>
+      </w:r>
+    </w:p>
+    <w:p>
+      <w:pPr>
+        <w:pBdr>
+          <w:left w:val="single" w:color="2E74B5" w:sz="18" w:space="12"/>
+        </w:pBdr>
+        <w:spacing w:after="60" w:before="60"/>
+        <w:ind w:left="420"/>
+      </w:pPr>
+      <w:r>
+        <w:rPr>
+          <w:color w:val="1F3864"/>
+        </w:rPr>
+        <w:t xml:space="preserve">"If something did make sense, how would a decision get made? Is it you and Drew, or does it go to the board? And is there a budget for this kind of thing yet, or would it need building?"</w:t>
+      </w:r>
+    </w:p>
+    <w:p>
+      <w:pPr>
+        <w:spacing w:after="80" w:before="80"/>
+      </w:pPr>
+      <w:r>
+        <w:rPr>
+          <w:i/>
+          <w:iCs/>
+          <w:color w:val="7F7F7F"/>
+        </w:rPr>
         <w:t xml:space="preserve">[If no budget: "That's fine. The first year can be small, a race or two with the right guests, and we'll tell you straight what's worth it." On timing, don't push for this season; 2027 planning is the realistic window.]</w:t>
       </w:r>
     </w:p>
@@ -802,7 +1003,7 @@
           <w:sz w:val="30"/>
           <w:szCs w:val="30"/>
         </w:rPr>
-        <w:t xml:space="preserve">4. If they ask: "Why are brands like us in Formula 1?"</w:t>
+        <w:t xml:space="preserve">5. If they ask: "Why are brands like us in Formula 1?"</w:t>
       </w:r>
     </w:p>
     <w:p>
@@ -999,7 +1200,7 @@
           <w:sz w:val="30"/>
           <w:szCs w:val="30"/>
         </w:rPr>
-        <w:t xml:space="preserve">5. If they ask: "How are similar brands activating?"</w:t>
+        <w:t xml:space="preserve">6. If they ask: "How are similar brands activating?"</w:t>
       </w:r>
     </w:p>
     <w:p>
@@ -1103,7 +1304,7 @@
           <w:sz w:val="30"/>
           <w:szCs w:val="30"/>
         </w:rPr>
-        <w:t xml:space="preserve">6. If they ask: "What can we do with the team's other partners?"</w:t>
+        <w:t xml:space="preserve">7. If they ask: "What can we do with the team's other partners?"</w:t>
       </w:r>
     </w:p>
     <w:p>
@@ -1280,7 +1481,7 @@
           <w:sz w:val="30"/>
           <w:szCs w:val="30"/>
         </w:rPr>
-        <w:t xml:space="preserve">7. If they ask: "Where could our product fit in the team?"</w:t>
+        <w:t xml:space="preserve">8. If they ask: "Where could our product fit in the team?"</w:t>
       </w:r>
     </w:p>
     <w:p>
@@ -1393,7 +1594,7 @@
         <w:t xml:space="preserve">Where to steer instead, for now:</w:t>
       </w:r>
       <w:r>
-        <w:t xml:space="preserve"> marketing-led options. Hospitality with buyers, content, and the partner network in section 6.</w:t>
+        <w:t xml:space="preserve"> marketing-led options. Hospitality with buyers, content, and the partner network in section 7.</w:t>
       </w:r>
     </w:p>
     <w:p>
@@ -1424,7 +1625,7 @@
           <w:sz w:val="30"/>
           <w:szCs w:val="30"/>
         </w:rPr>
-        <w:t xml:space="preserve">8. Other questions they may ask</w:t>
+        <w:t xml:space="preserve">9. Other questions they may ask</w:t>
       </w:r>
     </w:p>
     <w:p>
@@ -1588,7 +1789,7 @@
           <w:sz w:val="30"/>
           <w:szCs w:val="30"/>
         </w:rPr>
-        <w:t xml:space="preserve">9. Closing and next steps</w:t>
+        <w:t xml:space="preserve">10. Closing and next steps</w:t>
       </w:r>
     </w:p>
     <w:p>
@@ -1906,6 +2107,26 @@
       </w:r>
       <w:r>
         <w:t xml:space="preserve"> eridu.ai/pr/eridu-emerges-from-stealth-with-over-200m-in-funding/ ; techcrunch.com/2026/03/10/ai-network-startup-eridu-emerges-from-stealth-with-hefty-200m-series-a ; networkworld.com/article/4143119/eridu-exits-stealth-with-200m-to-rebuild-ai-networking.html ; sdxcentral.com/news/ai-switch-startup-eridu-exits-stealth-with-200m-to-shatter-network-wall/ ; simpletechtrend.com/en/post/eridu-delos-ocp-2026-multi-rack-single-hop-petabit-switch-en ; simplify.jobs/c/Eridu-AI ; laserfocusworld.com/test-measurement/research/article/16562540/infinera-appoints-michael-capuano-vp-of-corporate-marketing ; astonmartinf1.com/en-GB/news/announcement/aston-martin-aramco-announces-coreweave-as-official-ai-cloud-computing-partner ; coreweave.com/partnerships/aston-martin-aramco-f1 ; newsroom.arm.com/blog/aston-martin-aramco-f1-wind-tunnel-integration ; mercedesamgf1.com/promo/partner-summit-2025 ; si.com/onsi/f1/news/las-vegas-gp-doubles-as-a-boardroom-with-launch-of-the-f1-business-summit ; si.com/onsi/f1/jean-arnault-russell-wilson-and-gordon-ramsey-headline-expanded-f1-business-summit ; formula1.com/en/latest/article/formula-1-reveals-calendar-for-2026-season.YctbMZWqBvrgyddrnauo8</w:t>
+      </w:r>
+    </w:p>
+    <w:p>
+      <w:pPr>
+        <w:pStyle w:val="ListParagraph"/>
+        <w:numPr>
+          <w:ilvl w:val="0"/>
+          <w:numId w:val="1"/>
+        </w:numPr>
+        <w:spacing w:after="40" w:before="40"/>
+      </w:pPr>
+      <w:r>
+        <w:rPr>
+          <w:b/>
+          <w:bCs/>
+        </w:rPr>
+        <w:t xml:space="preserve">Category answer sources (section 3):</w:t>
+      </w:r>
+      <w:r>
+        <w:t xml:space="preserve"> Reuters, 4 May 2026, "As Formula One evolves, AI becomes part of the race": https://whbl.com/2026/05/04/motor-racing-as-formula-one-evolves-ai-becomes-part-of-the-race/ and https://www.timeslive.co.za/motoring/2026-05-04-as-formula-one-evolves-ai-is-fast-becoming-a-crucial-part-of-the-race/</w:t>
       </w:r>
     </w:p>
     <w:p>

</xml_diff>